<commit_message>
Update Guía para intancia de macros en subjerarquías.docx
</commit_message>
<xml_diff>
--- a/Guía para intancia de macros en subjerarquías.docx
+++ b/Guía para intancia de macros en subjerarquías.docx
@@ -361,16 +361,65 @@
       <w:pPr>
         <w:jc w:val="both"/>
         <w:rPr>
-          <w:u w:val="single"/>
-        </w:rPr>
-      </w:pPr>
-      <w:r>
+          <w:b/>
+          <w:bCs/>
+        </w:rPr>
+      </w:pPr>
+      <w:r>
+        <w:rPr>
+          <w:b/>
+          <w:bCs/>
+        </w:rPr>
         <w:lastRenderedPageBreak/>
+        <w:t xml:space="preserve">Aclaraciones y objetivos: </w:t>
+      </w:r>
+    </w:p>
+    <w:p>
+      <w:pPr>
+        <w:jc w:val="both"/>
+      </w:pPr>
+      <w:r>
         <w:t>El siguiente documento describe los pasos necesarios para incluir una macro precompilada dentro del “user_proj” del flujo de síntesis recomendado para “OpenFrame” (openlane).</w:t>
       </w:r>
       <w:r>
-        <w:t xml:space="preserve"> En este documento se prevé que el lector está familiarizado con el flujo y ha revisado previamente el documento guía creado por el Dr. Vidkar.</w:t>
-      </w:r>
+        <w:t xml:space="preserve"> </w:t>
+      </w:r>
+    </w:p>
+    <w:p>
+      <w:pPr>
+        <w:jc w:val="both"/>
+      </w:pPr>
+      <w:r>
+        <w:t>En este documento se prevé que el lector está familiarizado con el flujo</w:t>
+      </w:r>
+      <w:r>
+        <w:t xml:space="preserve"> </w:t>
+      </w:r>
+      <w:r>
+        <w:t>y ha revisado previamente el documento guía creado por el Dr. Vidkar.</w:t>
+      </w:r>
+    </w:p>
+    <w:p>
+      <w:pPr>
+        <w:jc w:val="both"/>
+      </w:pPr>
+      <w:r>
+        <w:t xml:space="preserve">Todos los archivos y códigos </w:t>
+      </w:r>
+      <w:r>
+        <w:t>mencionados aquí</w:t>
+      </w:r>
+      <w:r>
+        <w:t xml:space="preserve"> se encuentran publicados dentro del repositorio:  </w:t>
+      </w:r>
+      <w:hyperlink r:id="rId5" w:history="1">
+        <w:r>
+          <w:rPr>
+            <w:rStyle w:val="Hipervnculo"/>
+          </w:rPr>
+          <w:t>https://github.com/Manyberto/Instacia-de-macros</w:t>
+        </w:r>
+      </w:hyperlink>
     </w:p>
     <w:p>
       <w:pPr>
@@ -418,11 +467,6 @@
     </w:p>
     <w:p>
       <w:pPr>
-        <w:jc w:val="both"/>
-      </w:pPr>
-    </w:p>
-    <w:p>
-      <w:pPr>
         <w:jc w:val="center"/>
       </w:pPr>
       <w:r>
@@ -430,9 +474,9 @@
           <w:noProof/>
         </w:rPr>
         <w:drawing>
-          <wp:inline distT="0" distB="0" distL="0" distR="0" wp14:anchorId="2199A4AC" wp14:editId="65488227">
-            <wp:extent cx="4229100" cy="3418040"/>
-            <wp:effectExtent l="0" t="0" r="0" b="0"/>
+          <wp:inline distT="0" distB="0" distL="0" distR="0" wp14:anchorId="2199A4AC" wp14:editId="7B7E07E9">
+            <wp:extent cx="3981030" cy="3217545"/>
+            <wp:effectExtent l="0" t="0" r="635" b="1905"/>
             <wp:docPr id="648318863" name="Imagen 1"/>
             <wp:cNvGraphicFramePr>
               <a:graphicFrameLocks xmlns:a="http://schemas.openxmlformats.org/drawingml/2006/main" noChangeAspect="1"/>
@@ -445,7 +489,7 @@
                     <pic:cNvPicPr/>
                   </pic:nvPicPr>
                   <pic:blipFill>
-                    <a:blip r:embed="rId5">
+                    <a:blip r:embed="rId6">
                       <a:extLst>
                         <a:ext uri="{28A0092B-C50C-407E-A947-70E740481C1C}">
                           <a14:useLocalDpi xmlns:a14="http://schemas.microsoft.com/office/drawing/2010/main" val="0"/>
@@ -459,7 +503,7 @@
                   <pic:spPr>
                     <a:xfrm>
                       <a:off x="0" y="0"/>
-                      <a:ext cx="4240398" cy="3427171"/>
+                      <a:ext cx="3997840" cy="3231131"/>
                     </a:xfrm>
                     <a:prstGeom prst="rect">
                       <a:avLst/>
@@ -516,20 +560,27 @@
         <w:jc w:val="both"/>
       </w:pPr>
       <w:r>
-        <w:t xml:space="preserve">La idea principal de este documento es especificar la serie de pasos y configuraciones necesarios para </w:t>
+        <w:t xml:space="preserve">El objetivo </w:t>
+      </w:r>
+      <w:r>
+        <w:t xml:space="preserve">principal de este documento es especificar la serie de pasos y configuraciones necesarios para </w:t>
       </w:r>
       <w:r>
         <w:t>instanciar</w:t>
       </w:r>
       <w:r>
-        <w:t xml:space="preserve"> las macros requeridas por un proyecto, de forma simple y previamente validada. Esta guía toma como referencia principal la documentación disponible en los siguientes enlaces:</w:t>
-      </w:r>
-    </w:p>
-    <w:p>
-      <w:pPr>
-        <w:jc w:val="both"/>
-      </w:pPr>
-      <w:hyperlink r:id="rId6" w:history="1">
+        <w:t xml:space="preserve"> las macros requeridas por un proyecto, de </w:t>
+      </w:r>
+      <w:r>
+        <w:lastRenderedPageBreak/>
+        <w:t>forma simple y previamente validada. Esta guía toma como referencia principal la documentación disponible en los siguientes enlaces:</w:t>
+      </w:r>
+    </w:p>
+    <w:p>
+      <w:pPr>
+        <w:pStyle w:val="Sinespaciado"/>
+      </w:pPr>
+      <w:hyperlink r:id="rId7" w:history="1">
         <w:r>
           <w:rPr>
             <w:rStyle w:val="Hipervnculo"/>
@@ -540,9 +591,9 @@
     </w:p>
     <w:p>
       <w:pPr>
-        <w:jc w:val="both"/>
-      </w:pPr>
-      <w:hyperlink r:id="rId7" w:history="1">
+        <w:pStyle w:val="Sinespaciado"/>
+      </w:pPr>
+      <w:hyperlink r:id="rId8" w:history="1">
         <w:r>
           <w:rPr>
             <w:rStyle w:val="Hipervnculo"/>
@@ -554,22 +605,28 @@
     <w:p>
       <w:pPr>
         <w:jc w:val="both"/>
-      </w:pPr>
-      <w:r>
-        <w:lastRenderedPageBreak/>
-        <w:t>El</w:t>
-      </w:r>
-      <w:r>
-        <w:t xml:space="preserve"> procedimiento </w:t>
-      </w:r>
-      <w:r>
-        <w:t>es el</w:t>
-      </w:r>
-      <w:r>
-        <w:t xml:space="preserve"> siguiente</w:t>
-      </w:r>
-      <w:r>
-        <w:t>:</w:t>
+        <w:rPr>
+          <w:b/>
+          <w:bCs/>
+          <w:sz w:val="14"/>
+          <w:szCs w:val="14"/>
+        </w:rPr>
+      </w:pPr>
+    </w:p>
+    <w:p>
+      <w:pPr>
+        <w:jc w:val="both"/>
+        <w:rPr>
+          <w:b/>
+          <w:bCs/>
+        </w:rPr>
+      </w:pPr>
+      <w:r>
+        <w:rPr>
+          <w:b/>
+          <w:bCs/>
+        </w:rPr>
+        <w:t>Procedimiento</w:t>
       </w:r>
     </w:p>
     <w:p>
@@ -750,9 +807,9 @@
           <w:noProof/>
         </w:rPr>
         <w:drawing>
-          <wp:inline distT="0" distB="0" distL="0" distR="0" wp14:anchorId="438AB5A2" wp14:editId="7C20457C">
-            <wp:extent cx="3861803" cy="4338955"/>
-            <wp:effectExtent l="0" t="0" r="5715" b="4445"/>
+          <wp:inline distT="0" distB="0" distL="0" distR="0" wp14:anchorId="438AB5A2" wp14:editId="3F9C334F">
+            <wp:extent cx="2876550" cy="3231967"/>
+            <wp:effectExtent l="0" t="0" r="0" b="6985"/>
             <wp:docPr id="1899070533" name="Imagen 1"/>
             <wp:cNvGraphicFramePr>
               <a:graphicFrameLocks xmlns:a="http://schemas.openxmlformats.org/drawingml/2006/main" noChangeAspect="1"/>
@@ -765,7 +822,7 @@
                     <pic:cNvPicPr/>
                   </pic:nvPicPr>
                   <pic:blipFill>
-                    <a:blip r:embed="rId8"/>
+                    <a:blip r:embed="rId9"/>
                     <a:stretch>
                       <a:fillRect/>
                     </a:stretch>
@@ -773,7 +830,7 @@
                   <pic:spPr>
                     <a:xfrm>
                       <a:off x="0" y="0"/>
-                      <a:ext cx="3881376" cy="4360946"/>
+                      <a:ext cx="2908060" cy="3267370"/>
                     </a:xfrm>
                     <a:prstGeom prst="rect">
                       <a:avLst/>
@@ -890,9 +947,9 @@
           <w:noProof/>
         </w:rPr>
         <w:drawing>
-          <wp:inline distT="0" distB="0" distL="0" distR="0" wp14:anchorId="3A9E8F12" wp14:editId="7DB17D7D">
-            <wp:extent cx="4115697" cy="5162550"/>
-            <wp:effectExtent l="0" t="0" r="0" b="0"/>
+          <wp:inline distT="0" distB="0" distL="0" distR="0" wp14:anchorId="3A9E8F12" wp14:editId="1DF4071B">
+            <wp:extent cx="3867150" cy="4850783"/>
+            <wp:effectExtent l="0" t="0" r="0" b="6985"/>
             <wp:docPr id="418022581" name="Imagen 1"/>
             <wp:cNvGraphicFramePr>
               <a:graphicFrameLocks xmlns:a="http://schemas.openxmlformats.org/drawingml/2006/main" noChangeAspect="1"/>
@@ -905,7 +962,7 @@
                     <pic:cNvPicPr/>
                   </pic:nvPicPr>
                   <pic:blipFill>
-                    <a:blip r:embed="rId9"/>
+                    <a:blip r:embed="rId10"/>
                     <a:stretch>
                       <a:fillRect/>
                     </a:stretch>
@@ -913,7 +970,7 @@
                   <pic:spPr>
                     <a:xfrm>
                       <a:off x="0" y="0"/>
-                      <a:ext cx="4117829" cy="5165224"/>
+                      <a:ext cx="3874388" cy="4859862"/>
                     </a:xfrm>
                     <a:prstGeom prst="rect">
                       <a:avLst/>
@@ -967,7 +1024,6 @@
           <w:b/>
           <w:bCs/>
         </w:rPr>
-        <w:lastRenderedPageBreak/>
         <w:t xml:space="preserve">Nota 2: </w:t>
       </w:r>
       <w:r>
@@ -978,7 +1034,11 @@
         <w:t xml:space="preserve"> </w:t>
       </w:r>
       <w:r>
-        <w:t>Los archivos blackbox son módulos que definen únicamente la interfaz (puertos de entrada y salida) de la macro. Debido a que no se generan automáticamente al ejecutar el flujo con la configuración mostrada en la figura 2, deben crearse manualmente. En la figura 4 se ilustra un ejemplo de</w:t>
+        <w:t xml:space="preserve">Los archivos blackbox son módulos que definen únicamente la interfaz (puertos de entrada y salida) de la macro. Debido a que no se generan </w:t>
+      </w:r>
+      <w:r>
+        <w:lastRenderedPageBreak/>
+        <w:t>automáticamente al ejecutar el flujo con la configuración mostrada en la figura 2, deben crearse manualmente. En la figura 4 se ilustra un ejemplo de</w:t>
       </w:r>
       <w:r>
         <w:t>l</w:t>
@@ -1009,9 +1069,9 @@
           <w:noProof/>
         </w:rPr>
         <w:drawing>
-          <wp:inline distT="0" distB="0" distL="0" distR="0" wp14:anchorId="1D7106EE" wp14:editId="342122EC">
-            <wp:extent cx="5057775" cy="3573780"/>
-            <wp:effectExtent l="0" t="0" r="9525" b="7620"/>
+          <wp:inline distT="0" distB="0" distL="0" distR="0" wp14:anchorId="1D7106EE" wp14:editId="224F2BA2">
+            <wp:extent cx="3777155" cy="2668905"/>
+            <wp:effectExtent l="0" t="0" r="0" b="0"/>
             <wp:docPr id="392100229" name="Imagen 1"/>
             <wp:cNvGraphicFramePr>
               <a:graphicFrameLocks xmlns:a="http://schemas.openxmlformats.org/drawingml/2006/main" noChangeAspect="1"/>
@@ -1024,7 +1084,7 @@
                     <pic:cNvPicPr/>
                   </pic:nvPicPr>
                   <pic:blipFill rotWithShape="1">
-                    <a:blip r:embed="rId10"/>
+                    <a:blip r:embed="rId11"/>
                     <a:srcRect l="2376" r="7502"/>
                     <a:stretch>
                       <a:fillRect/>
@@ -1033,7 +1093,7 @@
                   <pic:spPr bwMode="auto">
                     <a:xfrm>
                       <a:off x="0" y="0"/>
-                      <a:ext cx="5057775" cy="3573780"/>
+                      <a:ext cx="3782047" cy="2672362"/>
                     </a:xfrm>
                     <a:prstGeom prst="rect">
                       <a:avLst/>
@@ -1158,7 +1218,6 @@
         <w:rPr>
           <w:noProof/>
         </w:rPr>
-        <w:lastRenderedPageBreak/>
         <w:drawing>
           <wp:inline distT="0" distB="0" distL="0" distR="0" wp14:anchorId="5C581999" wp14:editId="6ABFBC56">
             <wp:extent cx="5612130" cy="1934845"/>
@@ -1175,7 +1234,7 @@
                     <pic:cNvPicPr/>
                   </pic:nvPicPr>
                   <pic:blipFill>
-                    <a:blip r:embed="rId11"/>
+                    <a:blip r:embed="rId12"/>
                     <a:stretch>
                       <a:fillRect/>
                     </a:stretch>
@@ -1243,6 +1302,7 @@
           <w:b/>
           <w:bCs/>
         </w:rPr>
+        <w:lastRenderedPageBreak/>
         <w:t xml:space="preserve">Configuración para hardening de “user_proj”: </w:t>
       </w:r>
     </w:p>
@@ -1363,7 +1423,7 @@
                     <pic:cNvPicPr/>
                   </pic:nvPicPr>
                   <pic:blipFill>
-                    <a:blip r:embed="rId12"/>
+                    <a:blip r:embed="rId13"/>
                     <a:stretch>
                       <a:fillRect/>
                     </a:stretch>
@@ -1437,22 +1497,22 @@
         <w:jc w:val="both"/>
       </w:pPr>
       <w:r>
+        <w:t>En este caso particular, la macro “sram_dualport_32x32” se utiliza para las memorias de entrada (dos), mientras que la “sram_dualport_64x32” para la única memoria de salida.</w:t>
+      </w:r>
+      <w:r>
+        <w:t xml:space="preserve"> La figura 6 muestra el GDS resultante de correr dicha configuración.</w:t>
+      </w:r>
+    </w:p>
+    <w:p>
+      <w:pPr>
+        <w:ind w:left="948"/>
+        <w:jc w:val="center"/>
+      </w:pPr>
+      <w:r>
+        <w:rPr>
+          <w:noProof/>
+        </w:rPr>
         <w:lastRenderedPageBreak/>
-        <w:t>En este caso particular, la macro “sram_dualport_32x32” se utiliza para las memorias de entrada (dos), mientras que la “sram_dualport_64x32” para la única memoria de salida.</w:t>
-      </w:r>
-      <w:r>
-        <w:t xml:space="preserve"> La figura 6 muestra el GDS resultante de correr dicha configuración.</w:t>
-      </w:r>
-    </w:p>
-    <w:p>
-      <w:pPr>
-        <w:ind w:left="948"/>
-        <w:jc w:val="center"/>
-      </w:pPr>
-      <w:r>
-        <w:rPr>
-          <w:noProof/>
-        </w:rPr>
         <w:drawing>
           <wp:inline distT="0" distB="0" distL="0" distR="0" wp14:anchorId="0E2BABC2" wp14:editId="7FA52A10">
             <wp:extent cx="5612130" cy="3230880"/>
@@ -1469,7 +1529,7 @@
                     <pic:cNvPicPr/>
                   </pic:nvPicPr>
                   <pic:blipFill>
-                    <a:blip r:embed="rId13"/>
+                    <a:blip r:embed="rId14"/>
                     <a:stretch>
                       <a:fillRect/>
                     </a:stretch>
@@ -1539,7 +1599,7 @@
         <w:t xml:space="preserve">La posición de cada macro se encuentra </w:t>
       </w:r>
       <w:r>
-        <w:t>especificada dentro del archivo “</w:t>
+        <w:t>dentro del archivo “</w:t>
       </w:r>
       <w:proofErr w:type="spellStart"/>
       <w:r>
@@ -1575,7 +1635,7 @@
                     <pic:cNvPicPr/>
                   </pic:nvPicPr>
                   <pic:blipFill rotWithShape="1">
-                    <a:blip r:embed="rId14"/>
+                    <a:blip r:embed="rId15"/>
                     <a:srcRect r="3258" b="30540"/>
                     <a:stretch>
                       <a:fillRect/>
@@ -1668,7 +1728,7 @@
         <w:jc w:val="both"/>
       </w:pPr>
       <w:r>
-        <w:t xml:space="preserve">Como podrás observar, </w:t>
+        <w:t xml:space="preserve">Como podrás observar </w:t>
       </w:r>
       <w:r>
         <w:t xml:space="preserve">en el archivo </w:t>
@@ -1677,10 +1737,12 @@
         <w:t>“</w:t>
       </w:r>
       <w:proofErr w:type="spellStart"/>
+      <w:proofErr w:type="gramStart"/>
       <w:r>
         <w:t>config.json</w:t>
       </w:r>
       <w:proofErr w:type="spellEnd"/>
+      <w:proofErr w:type="gramEnd"/>
       <w:r>
         <w:t>”</w:t>
       </w:r>
@@ -1694,20 +1756,22 @@
         <w:t>"FP_PDN_MACRO_HOOKS"</w:t>
       </w:r>
       <w:r>
-        <w:t xml:space="preserve"> no es necesario incluir la ruta jerárquica completa de la instancia de la macro, basta con agregar el prefijo “.*</w:t>
-      </w:r>
-      <w:r>
-        <w:t>”  junto al nombre de la instancia, tal como se aprecia en la l</w:t>
+        <w:t xml:space="preserve"> no es necesario incluir la ruta jerárquica completa de la instancia de la macro, basta con agregar el prefijo </w:t>
+      </w:r>
+      <w:proofErr w:type="gramStart"/>
+      <w:r>
+        <w:t>“.*</w:t>
+      </w:r>
+      <w:r>
+        <w:t>”  junto</w:t>
+      </w:r>
+      <w:proofErr w:type="gramEnd"/>
+      <w:r>
+        <w:t xml:space="preserve"> al nombre de la instancia, tal como se aprecia en la l</w:t>
       </w:r>
       <w:r>
         <w:t>ínea 78 de la figura 5.</w:t>
       </w:r>
-    </w:p>
-    <w:p>
-      <w:pPr>
-        <w:ind w:left="948"/>
-        <w:jc w:val="both"/>
-      </w:pPr>
     </w:p>
     <w:p>
       <w:pPr>
@@ -1719,7 +1783,6 @@
         <w:jc w:val="both"/>
       </w:pPr>
       <w:r>
-        <w:lastRenderedPageBreak/>
         <w:t>Realizar el hardening del wrapper.</w:t>
       </w:r>
     </w:p>
@@ -1802,7 +1865,7 @@
                     <pic:cNvPicPr/>
                   </pic:nvPicPr>
                   <pic:blipFill>
-                    <a:blip r:embed="rId15"/>
+                    <a:blip r:embed="rId16"/>
                     <a:stretch>
                       <a:fillRect/>
                     </a:stretch>
@@ -1905,19 +1968,10 @@
         <w:t xml:space="preserve"> </w:t>
       </w:r>
       <w:r>
-        <w:t xml:space="preserve">Los archivos </w:t>
-      </w:r>
-      <w:r>
-        <w:t xml:space="preserve">de configuración mencionados en esta guía se encuentran </w:t>
-      </w:r>
-      <w:r>
-        <w:t>publicados</w:t>
-      </w:r>
-      <w:r>
-        <w:t xml:space="preserve"> en el </w:t>
-      </w:r>
-      <w:r>
-        <w:t>siguiente repositorio:</w:t>
+        <w:t>Los archivos de configuración mencionados en esta guía están disponibles en el siguiente repositorio, organizados por nivel de jerarquía</w:t>
+      </w:r>
+      <w:r>
+        <w:t>.</w:t>
       </w:r>
     </w:p>
     <w:p>
@@ -1931,12 +1985,24 @@
         <w:pStyle w:val="Prrafodelista"/>
         <w:jc w:val="both"/>
       </w:pPr>
-      <w:hyperlink r:id="rId16" w:history="1">
+      <w:hyperlink r:id="rId17" w:history="1">
         <w:r>
           <w:rPr>
             <w:rStyle w:val="Hipervnculo"/>
           </w:rPr>
-          <w:t>https://github.com/Manyberto/Instacia-de-macros</w:t>
+          <w:t>https://github.com/Manyberto/Instac</w:t>
+        </w:r>
+        <w:r>
+          <w:rPr>
+            <w:rStyle w:val="Hipervnculo"/>
+          </w:rPr>
+          <w:t>i</w:t>
+        </w:r>
+        <w:r>
+          <w:rPr>
+            <w:rStyle w:val="Hipervnculo"/>
+          </w:rPr>
+          <w:t>a-de-macros</w:t>
         </w:r>
       </w:hyperlink>
     </w:p>
@@ -2908,7 +2974,6 @@
   <w:style w:type="character" w:default="1" w:styleId="Fuentedeprrafopredeter">
     <w:name w:val="Default Paragraph Font"/>
     <w:uiPriority w:val="1"/>
-    <w:semiHidden/>
     <w:unhideWhenUsed/>
   </w:style>
   <w:style w:type="table" w:default="1" w:styleId="Tablanormal">
@@ -3262,6 +3327,27 @@
     <w:rPr>
       <w:color w:val="605E5C"/>
       <w:shd w:val="clear" w:color="auto" w:fill="E1DFDD"/>
+    </w:rPr>
+  </w:style>
+  <w:style w:type="paragraph" w:styleId="Sinespaciado">
+    <w:name w:val="No Spacing"/>
+    <w:uiPriority w:val="1"/>
+    <w:qFormat/>
+    <w:rsid w:val="00015A71"/>
+    <w:pPr>
+      <w:spacing w:after="0" w:line="240" w:lineRule="auto"/>
+    </w:pPr>
+  </w:style>
+  <w:style w:type="character" w:styleId="Hipervnculovisitado">
+    <w:name w:val="FollowedHyperlink"/>
+    <w:basedOn w:val="Fuentedeprrafopredeter"/>
+    <w:uiPriority w:val="99"/>
+    <w:semiHidden/>
+    <w:unhideWhenUsed/>
+    <w:rsid w:val="00926D39"/>
+    <w:rPr>
+      <w:color w:val="96607D" w:themeColor="followedHyperlink"/>
+      <w:u w:val="single"/>
     </w:rPr>
   </w:style>
 </w:styles>

</xml_diff>